<commit_message>
feat: Revise the poster rubric and add an AI-use disclosure
Rubric: Data Preparation 20 -> 18, Baseline 20 -> 17, criterion 6
rewritten to the paired per-fold comparison against a predeclared
margin (CV inference doctrine; feedback only at M09, scored from M10),
and a new 5-point criterion 8 for sources, acknowledgments, AI use
disclosure and data privacy. Notes cover the honors section. Total 100.

Template: an AI USE DISCLOSURE section under Acknowledgements, per the
syllabus AI Policy. M09/M10 instructions and the milestone reference
updated to match.

Co-Authored-By: Claude Opus 5.5 <noreply@anthropic.com>
</commit_message>
<xml_diff>
--- a/_final_project/2026F/rubric/Predictive_Analytics_Poster_Rubric.docx
+++ b/_final_project/2026F/rubric/Predictive_Analytics_Poster_Rubric.docx
@@ -41,6 +41,8 @@
       <w:tr>
         <w:trPr>
           <w:cnfStyle w:val="100000000000" w:firstRow="1" w:lastRow="0" w:firstColumn="0" w:lastColumn="0" w:oddVBand="0" w:evenVBand="0" w:oddHBand="0" w:evenHBand="0" w:firstRowFirstColumn="0" w:firstRowLastColumn="0" w:lastRowFirstColumn="0" w:lastRowLastColumn="0"/>
+          <w:cantSplit/>
+          <w:tblHeader/>
         </w:trPr>
         <w:tc>
           <w:tcPr>
@@ -184,6 +186,7 @@
       <w:tr>
         <w:trPr>
           <w:cnfStyle w:val="000000100000" w:firstRow="0" w:lastRow="0" w:firstColumn="0" w:lastColumn="0" w:oddVBand="0" w:evenVBand="0" w:oddHBand="1" w:evenHBand="0" w:firstRowFirstColumn="0" w:firstRowLastColumn="0" w:lastRowFirstColumn="0" w:lastRowLastColumn="0"/>
+          <w:cantSplit/>
         </w:trPr>
         <w:tc>
           <w:tcPr>
@@ -343,6 +346,9 @@
         </w:tc>
       </w:tr>
       <w:tr>
+        <w:trPr>
+          <w:cantSplit/>
+        </w:trPr>
         <w:tc>
           <w:tcPr>
             <w:cnfStyle w:val="001000000000" w:firstRow="0" w:lastRow="0" w:firstColumn="1" w:lastColumn="0" w:oddVBand="0" w:evenVBand="0" w:oddHBand="0" w:evenHBand="0" w:firstRowFirstColumn="0" w:firstRowLastColumn="0" w:lastRowFirstColumn="0" w:lastRowLastColumn="0"/>
@@ -485,6 +491,7 @@
       <w:tr>
         <w:trPr>
           <w:cnfStyle w:val="000000100000" w:firstRow="0" w:lastRow="0" w:firstColumn="0" w:lastColumn="0" w:oddVBand="0" w:evenVBand="0" w:oddHBand="1" w:evenHBand="0" w:firstRowFirstColumn="0" w:firstRowLastColumn="0" w:lastRowFirstColumn="0" w:lastRowLastColumn="0"/>
+          <w:cantSplit/>
         </w:trPr>
         <w:tc>
           <w:tcPr>
@@ -626,6 +633,9 @@
         </w:tc>
       </w:tr>
       <w:tr>
+        <w:trPr>
+          <w:cantSplit/>
+        </w:trPr>
         <w:tc>
           <w:tcPr>
             <w:cnfStyle w:val="001000000000" w:firstRow="0" w:lastRow="0" w:firstColumn="1" w:lastColumn="0" w:oddVBand="0" w:evenVBand="0" w:oddHBand="0" w:evenHBand="0" w:firstRowFirstColumn="0" w:firstRowLastColumn="0" w:lastRowFirstColumn="0" w:lastRowLastColumn="0"/>
@@ -723,7 +733,7 @@
                 <w:sz w:val="21"/>
                 <w:szCs w:val="21"/>
               </w:rPr>
-              <w:t>20</w:t>
+              <w:t>18</w:t>
             </w:r>
           </w:p>
         </w:tc>
@@ -746,7 +756,7 @@
                 <w:sz w:val="21"/>
                 <w:szCs w:val="21"/>
               </w:rPr>
-              <w:t>17–20 pts: ≥1 non-trivial new feature (interactions, lags/rolling stats, domain-driven ratios, text-derived signals) with clear rationale; quantifies missingness by feature; justified strategy (drop/impute/advanced) with leakage-safe implementation; demonstrates impact via ablation/CV deltas or sensitivity to imputation choices.</w:t>
+              <w:t>15–18 pts: ≥1 non-trivial new feature (interactions, lags/rolling stats, domain-driven ratios, text-derived signals) with clear rationale; quantifies missingness by feature; justified strategy (drop/impute/advanced) with leakage-safe implementation; demonstrates impact via ablation/CV deltas or sensitivity to imputation choices.</w:t>
             </w:r>
           </w:p>
         </w:tc>
@@ -769,7 +779,7 @@
                 <w:sz w:val="21"/>
                 <w:szCs w:val="21"/>
               </w:rPr>
-              <w:t>10–16 pts: New feature with partial rationale; identifies missingness and applies a reasonable method; limited evidence of impact or sensitivity analysis.</w:t>
+              <w:t>9–14 pts: New feature with partial rationale; identifies missingness and applies a reasonable method; limited evidence of impact or sensitivity analysis.</w:t>
             </w:r>
           </w:p>
         </w:tc>
@@ -792,7 +802,7 @@
                 <w:sz w:val="21"/>
                 <w:szCs w:val="21"/>
               </w:rPr>
-              <w:t>0–9 pts: No new/trivial feature; missingness unreported or mishandled; unjustified/inappropriate method; no evidence of value.</w:t>
+              <w:t>0–8 pts: No new/trivial feature; missingness unreported or mishandled; unjustified/inappropriate method; no evidence of value.</w:t>
             </w:r>
           </w:p>
         </w:tc>
@@ -800,6 +810,7 @@
       <w:tr>
         <w:trPr>
           <w:cnfStyle w:val="000000100000" w:firstRow="0" w:lastRow="0" w:firstColumn="0" w:lastColumn="0" w:oddVBand="0" w:evenVBand="0" w:oddHBand="1" w:evenHBand="0" w:firstRowFirstColumn="0" w:firstRowLastColumn="0" w:lastRowFirstColumn="0" w:lastRowLastColumn="0"/>
+          <w:cantSplit/>
         </w:trPr>
         <w:tc>
           <w:tcPr>
@@ -866,7 +877,7 @@
                 <w:sz w:val="21"/>
                 <w:szCs w:val="21"/>
               </w:rPr>
-              <w:t>20</w:t>
+              <w:t>17</w:t>
             </w:r>
           </w:p>
         </w:tc>
@@ -889,7 +900,7 @@
                 <w:sz w:val="21"/>
                 <w:szCs w:val="21"/>
               </w:rPr>
-              <w:t>17–20 pts: Appropriate simple baseline (e.g., Linear/Logistic Regression); pipeline is leakage-safe; k=5/10 CV with correct metric (RMSE/MAE/Accuracy/F1/AUC); tracks mean/variance; summarizes implications and limitations; proposes concrete next steps.</w:t>
+              <w:t>14–17 pts: Appropriate simple baseline (e.g., Linear/Logistic Regression); pipeline is leakage-safe; k=5/10 CV with correct metric (RMSE/MAE/Accuracy/F1/AUC); tracks mean/variance; summarizes implications and limitations; proposes concrete next steps.</w:t>
             </w:r>
           </w:p>
         </w:tc>
@@ -912,7 +923,7 @@
                 <w:sz w:val="21"/>
                 <w:szCs w:val="21"/>
               </w:rPr>
-              <w:t>10–16 pts: Reasonable model; CV present with partial integration/details; metric adequate; interpretation limited or generic.</w:t>
+              <w:t>8–13 pts: Reasonable model; CV present with partial integration/details; metric adequate; interpretation limited or generic.</w:t>
             </w:r>
           </w:p>
         </w:tc>
@@ -935,12 +946,15 @@
                 <w:sz w:val="21"/>
                 <w:szCs w:val="21"/>
               </w:rPr>
-              <w:t>0–9 pts: Inappropriate/unspecified baseline; no/incorrect CV; unclear metric; raw numbers only; no reflection.</w:t>
+              <w:t>0–7 pts: Inappropriate/unspecified baseline; no/incorrect CV; unclear metric; raw numbers only; no reflection.</w:t>
             </w:r>
           </w:p>
         </w:tc>
       </w:tr>
       <w:tr>
+        <w:trPr>
+          <w:cantSplit/>
+        </w:trPr>
         <w:tc>
           <w:tcPr>
             <w:cnfStyle w:val="001000000000" w:firstRow="0" w:lastRow="0" w:firstColumn="1" w:lastColumn="0" w:oddVBand="0" w:evenVBand="0" w:oddHBand="0" w:evenHBand="0" w:firstRowFirstColumn="0" w:firstRowLastColumn="0" w:lastRowFirstColumn="0" w:lastRowLastColumn="0"/>
@@ -983,7 +997,7 @@
                 <w:sz w:val="21"/>
                 <w:szCs w:val="21"/>
               </w:rPr>
-              <w:t>More Complex Model (Choice, Tuning, Comparison)</w:t>
+              <w:t>More Complex Model (Choice, Tuning, Paired Comparison)</w:t>
             </w:r>
           </w:p>
         </w:tc>
@@ -1029,7 +1043,7 @@
                 <w:sz w:val="21"/>
                 <w:szCs w:val="21"/>
               </w:rPr>
-              <w:t>22–25 pts: Model aligned to data/goal (RF/GBM/XGBoost/SVM/regularized GLM/NN); hyperparameter search (grid/random/Bayesian) inside proper CV; leakage controls (scaling/encoding inside folds); comparative results (tables/plots) with variability and selection criterion; rigorous comparison to baseline with practical interpretation (effect sizes, trade-offs), plus error/confusion analysis where relevant.</w:t>
+              <w:t>22–25 pts: Model aligned to data/goal (RF/GBM/XGBoost/SVM/regularized GLM/NN); hyperparameter search (grid/random/Bayesian) inside proper CV; leakage controls (scaling/encoding inside folds); compared with the baseline on identical folds (same splitter and seed) using per-fold paired differences, against a practical margin stated before the results; mean paired difference reported with an approximate 95% interval labeled descriptive; verdict names the correct outcome: real difference (every fold favors the same model and the gap clears the margin), inconclusive (the sign changes across folds), or practically equivalent (same sign but under the margin, so the simpler model wins); practical interpretation (effect sizes, trade-offs), plus error/confusion analysis where relevant.</w:t>
             </w:r>
           </w:p>
         </w:tc>
@@ -1052,7 +1066,7 @@
                 <w:sz w:val="21"/>
                 <w:szCs w:val="21"/>
               </w:rPr>
-              <w:t>13–21 pts: Plausible model; some tuning with partial documentation; CV present but thin; basic comparison to baseline; limited practical takeaways.</w:t>
+              <w:t>13–21 pts: Plausible model; some tuning with partial documentation; CV present but thin; compares with the baseline on CV means or side-by-side intervals rather than paired per-fold differences, judges a winner or a tie by whether intervals overlap, or states no margin; limited practical takeaways.</w:t>
             </w:r>
           </w:p>
         </w:tc>
@@ -1083,6 +1097,7 @@
       <w:tr>
         <w:trPr>
           <w:cnfStyle w:val="000000100000" w:firstRow="0" w:lastRow="0" w:firstColumn="0" w:lastColumn="0" w:oddVBand="0" w:evenVBand="0" w:oddHBand="1" w:evenHBand="0" w:firstRowFirstColumn="0" w:firstRowLastColumn="0" w:lastRowFirstColumn="0" w:lastRowLastColumn="0"/>
+          <w:cantSplit/>
         </w:trPr>
         <w:tc>
           <w:tcPr>
@@ -1223,7 +1238,279 @@
           </w:p>
         </w:tc>
       </w:tr>
+      <w:tr>
+        <w:trPr>
+          <w:cnfStyle w:val="000000100000" w:firstRow="0" w:lastRow="0" w:firstColumn="0" w:lastColumn="0" w:oddVBand="0" w:evenVBand="0" w:oddHBand="1" w:evenHBand="0" w:firstRowFirstColumn="0" w:firstRowLastColumn="0" w:lastRowFirstColumn="0" w:lastRowLastColumn="0"/>
+          <w:cantSplit/>
+        </w:trPr>
+        <w:tc>
+          <w:tcPr>
+            <w:cnfStyle w:val="001000000000" w:firstRow="0" w:lastRow="0" w:firstColumn="1" w:lastColumn="0" w:oddVBand="0" w:evenVBand="0" w:oddHBand="0" w:evenHBand="0" w:firstRowFirstColumn="0" w:firstRowLastColumn="0" w:lastRowFirstColumn="0" w:lastRowLastColumn="0"/>
+            <w:tcW w:w="122" w:type="pct"/>
+          </w:tcPr>
+          <w:p>
+            <w:pPr>
+              <w:rPr>
+                <w:rFonts w:ascii="Times New Roman" w:hAnsi="Times New Roman" w:cs="Times New Roman"/>
+                <w:sz w:val="21"/>
+                <w:szCs w:val="21"/>
+              </w:rPr>
+            </w:pPr>
+            <w:r>
+              <w:rPr>
+                <w:rFonts w:ascii="Times New Roman" w:hAnsi="Times New Roman" w:cs="Times New Roman"/>
+                <w:sz w:val="21"/>
+                <w:szCs w:val="21"/>
+              </w:rPr>
+              <w:t>8</w:t>
+            </w:r>
+          </w:p>
+        </w:tc>
+        <w:tc>
+          <w:tcPr>
+            <w:tcW w:w="658" w:type="pct"/>
+          </w:tcPr>
+          <w:p>
+            <w:pPr>
+              <w:cnfStyle w:val="000000100000" w:firstRow="0" w:lastRow="0" w:firstColumn="0" w:lastColumn="0" w:oddVBand="0" w:evenVBand="0" w:oddHBand="1" w:evenHBand="0" w:firstRowFirstColumn="0" w:firstRowLastColumn="0" w:lastRowFirstColumn="0" w:lastRowLastColumn="0"/>
+              <w:rPr>
+                <w:rFonts w:ascii="Times New Roman" w:hAnsi="Times New Roman" w:cs="Times New Roman"/>
+                <w:sz w:val="21"/>
+                <w:szCs w:val="21"/>
+              </w:rPr>
+            </w:pPr>
+            <w:r>
+              <w:rPr>
+                <w:rFonts w:ascii="Times New Roman" w:hAnsi="Times New Roman" w:cs="Times New Roman"/>
+                <w:sz w:val="21"/>
+                <w:szCs w:val="21"/>
+              </w:rPr>
+              <w:t>Sources, Acknowledgments, AI Use &amp; Data Privacy</w:t>
+            </w:r>
+          </w:p>
+        </w:tc>
+        <w:tc>
+          <w:tcPr>
+            <w:tcW w:w="298" w:type="pct"/>
+          </w:tcPr>
+          <w:p>
+            <w:pPr>
+              <w:cnfStyle w:val="000000100000" w:firstRow="0" w:lastRow="0" w:firstColumn="0" w:lastColumn="0" w:oddVBand="0" w:evenVBand="0" w:oddHBand="1" w:evenHBand="0" w:firstRowFirstColumn="0" w:firstRowLastColumn="0" w:lastRowFirstColumn="0" w:lastRowLastColumn="0"/>
+              <w:rPr>
+                <w:rFonts w:ascii="Times New Roman" w:hAnsi="Times New Roman" w:cs="Times New Roman"/>
+                <w:sz w:val="21"/>
+                <w:szCs w:val="21"/>
+              </w:rPr>
+            </w:pPr>
+            <w:r>
+              <w:rPr>
+                <w:rFonts w:ascii="Times New Roman" w:hAnsi="Times New Roman" w:cs="Times New Roman"/>
+                <w:sz w:val="21"/>
+                <w:szCs w:val="21"/>
+              </w:rPr>
+              <w:t>5</w:t>
+            </w:r>
+          </w:p>
+        </w:tc>
+        <w:tc>
+          <w:tcPr>
+            <w:tcW w:w="1884" w:type="pct"/>
+          </w:tcPr>
+          <w:p>
+            <w:pPr>
+              <w:cnfStyle w:val="000000100000" w:firstRow="0" w:lastRow="0" w:firstColumn="0" w:lastColumn="0" w:oddVBand="0" w:evenVBand="0" w:oddHBand="1" w:evenHBand="0" w:firstRowFirstColumn="0" w:firstRowLastColumn="0" w:lastRowFirstColumn="0" w:lastRowLastColumn="0"/>
+              <w:rPr>
+                <w:rFonts w:ascii="Times New Roman" w:hAnsi="Times New Roman" w:cs="Times New Roman"/>
+                <w:sz w:val="21"/>
+                <w:szCs w:val="21"/>
+              </w:rPr>
+            </w:pPr>
+            <w:r>
+              <w:rPr>
+                <w:rFonts w:ascii="Times New Roman" w:hAnsi="Times New Roman" w:cs="Times New Roman"/>
+                <w:sz w:val="21"/>
+                <w:szCs w:val="21"/>
+              </w:rPr>
+              <w:t>5 pts: Data source cited (provider, URL or DOI, version or access date); references support the business-problem claims and the main software is credited (e.g., scikit-learn, pandas); Acknowledgments section names the Mitch Daniels School of Business, Prof. Moreira, the TAs, and other contributors; AI Use Disclosure names each AI tool and what it was used for and states that the team verified the output (or states that no AI tools were used); only aggregated or anonymized data and examples.</w:t>
+            </w:r>
+          </w:p>
+        </w:tc>
+        <w:tc>
+          <w:tcPr>
+            <w:tcW w:w="920" w:type="pct"/>
+          </w:tcPr>
+          <w:p>
+            <w:pPr>
+              <w:cnfStyle w:val="000000100000" w:firstRow="0" w:lastRow="0" w:firstColumn="0" w:lastColumn="0" w:oddVBand="0" w:evenVBand="0" w:oddHBand="1" w:evenHBand="0" w:firstRowFirstColumn="0" w:firstRowLastColumn="0" w:lastRowFirstColumn="0" w:lastRowLastColumn="0"/>
+              <w:rPr>
+                <w:rFonts w:ascii="Times New Roman" w:hAnsi="Times New Roman" w:cs="Times New Roman"/>
+                <w:sz w:val="21"/>
+                <w:szCs w:val="21"/>
+              </w:rPr>
+            </w:pPr>
+            <w:r>
+              <w:rPr>
+                <w:rFonts w:ascii="Times New Roman" w:hAnsi="Times New Roman" w:cs="Times New Roman"/>
+                <w:sz w:val="21"/>
+                <w:szCs w:val="21"/>
+              </w:rPr>
+              <w:t>3–4 pts: AI Use Disclosure present but vague (names tools without saying what they did), or one other element missing or incomplete (e.g., acknowledgments omit the TAs; data source cited without references or tools). No privacy issue.</w:t>
+            </w:r>
+          </w:p>
+        </w:tc>
+        <w:tc>
+          <w:tcPr>
+            <w:tcW w:w="1118" w:type="pct"/>
+          </w:tcPr>
+          <w:p>
+            <w:pPr>
+              <w:cnfStyle w:val="000000100000" w:firstRow="0" w:lastRow="0" w:firstColumn="0" w:lastColumn="0" w:oddVBand="0" w:evenVBand="0" w:oddHBand="1" w:evenHBand="0" w:firstRowFirstColumn="0" w:firstRowLastColumn="0" w:lastRowFirstColumn="0" w:lastRowLastColumn="0"/>
+              <w:rPr>
+                <w:rFonts w:ascii="Times New Roman" w:hAnsi="Times New Roman" w:cs="Times New Roman"/>
+                <w:sz w:val="21"/>
+                <w:szCs w:val="21"/>
+              </w:rPr>
+            </w:pPr>
+            <w:r>
+              <w:rPr>
+                <w:rFonts w:ascii="Times New Roman" w:hAnsi="Times New Roman" w:cs="Times New Roman"/>
+                <w:sz w:val="21"/>
+                <w:szCs w:val="21"/>
+              </w:rPr>
+              <w:t>0–2 pts: No AI Use Disclosure, or two or more other elements missing. Any personally identifiable or NDA-restricted data on the poster scores 0 here and must be removed before printing.</w:t>
+            </w:r>
+          </w:p>
+        </w:tc>
+      </w:tr>
     </w:tbl>
+    <w:p>
+      <w:pPr>
+        <w:spacing w:before="120" w:after="0"/>
+        <w:jc w:val="left"/>
+        <w:rPr>
+          <w:rFonts w:ascii="Times New Roman" w:hAnsi="Times New Roman" w:cs="Times New Roman"/>
+          <w:b/>
+          <w:bCs/>
+          <w:sz w:val="21"/>
+          <w:szCs w:val="21"/>
+        </w:rPr>
+      </w:pPr>
+      <w:r>
+        <w:rPr>
+          <w:rFonts w:ascii="Times New Roman" w:hAnsi="Times New Roman" w:cs="Times New Roman"/>
+          <w:b/>
+          <w:bCs/>
+          <w:sz w:val="21"/>
+          <w:szCs w:val="21"/>
+        </w:rPr>
+        <w:t>Total:</w:t>
+      </w:r>
+      <w:r>
+        <w:rPr>
+          <w:rFonts w:ascii="Times New Roman" w:hAnsi="Times New Roman" w:cs="Times New Roman"/>
+          <w:bCs/>
+          <w:sz w:val="21"/>
+          <w:szCs w:val="21"/>
+        </w:rPr>
+        <w:t xml:space="preserve"> 100 points. This rubric grades M09 (poster first draft), M10 (final poster), and the Instructor/TA evaluation after the conference.</w:t>
+      </w:r>
+    </w:p>
+    <w:p>
+      <w:pPr>
+        <w:spacing w:before="40" w:after="0"/>
+        <w:jc w:val="left"/>
+        <w:rPr>
+          <w:rFonts w:ascii="Times New Roman" w:hAnsi="Times New Roman" w:cs="Times New Roman"/>
+          <w:b/>
+          <w:bCs/>
+          <w:sz w:val="21"/>
+          <w:szCs w:val="21"/>
+        </w:rPr>
+      </w:pPr>
+      <w:r>
+        <w:rPr>
+          <w:rFonts w:ascii="Times New Roman" w:hAnsi="Times New Roman" w:cs="Times New Roman"/>
+          <w:b/>
+          <w:bCs/>
+          <w:sz w:val="21"/>
+          <w:szCs w:val="21"/>
+        </w:rPr>
+        <w:t>Criterion 6 at M09:</w:t>
+      </w:r>
+      <w:r>
+        <w:rPr>
+          <w:rFonts w:ascii="Times New Roman" w:hAnsi="Times New Roman" w:cs="Times New Roman"/>
+          <w:bCs/>
+          <w:sz w:val="21"/>
+          <w:szCs w:val="21"/>
+        </w:rPr>
+        <w:t xml:space="preserve"> a comparison that lacks per-fold paired differences or a stated margin gets feedback, not a deduction, on the first draft. Both are scored from M10.</w:t>
+      </w:r>
+    </w:p>
+    <w:p>
+      <w:pPr>
+        <w:spacing w:before="40" w:after="0"/>
+        <w:jc w:val="left"/>
+        <w:rPr>
+          <w:rFonts w:ascii="Times New Roman" w:hAnsi="Times New Roman" w:cs="Times New Roman"/>
+          <w:b/>
+          <w:bCs/>
+          <w:sz w:val="21"/>
+          <w:szCs w:val="21"/>
+        </w:rPr>
+      </w:pPr>
+      <w:r>
+        <w:rPr>
+          <w:rFonts w:ascii="Times New Roman" w:hAnsi="Times New Roman" w:cs="Times New Roman"/>
+          <w:b/>
+          <w:bCs/>
+          <w:sz w:val="21"/>
+          <w:szCs w:val="21"/>
+        </w:rPr>
+        <w:t>AI use:</w:t>
+      </w:r>
+      <w:r>
+        <w:rPr>
+          <w:rFonts w:ascii="Times New Roman" w:hAnsi="Times New Roman" w:cs="Times New Roman"/>
+          <w:bCs/>
+          <w:sz w:val="21"/>
+          <w:szCs w:val="21"/>
+        </w:rPr>
+        <w:t xml:space="preserve"> per the syllabus AI Policy, every poster carries an AI Use Disclosure (the template has a section for it). Errors in AI-assisted work are the team’s responsibility.</w:t>
+      </w:r>
+    </w:p>
+    <w:p>
+      <w:pPr>
+        <w:spacing w:before="40" w:after="0"/>
+        <w:jc w:val="left"/>
+        <w:rPr>
+          <w:rFonts w:ascii="Times New Roman" w:hAnsi="Times New Roman" w:cs="Times New Roman"/>
+          <w:b/>
+          <w:bCs/>
+          <w:sz w:val="21"/>
+          <w:szCs w:val="21"/>
+        </w:rPr>
+      </w:pPr>
+      <w:r>
+        <w:rPr>
+          <w:rFonts w:ascii="Times New Roman" w:hAnsi="Times New Roman" w:cs="Times New Roman"/>
+          <w:b/>
+          <w:bCs/>
+          <w:sz w:val="21"/>
+          <w:szCs w:val="21"/>
+        </w:rPr>
+        <w:t>Honors:</w:t>
+      </w:r>
+      <w:r>
+        <w:rPr>
+          <w:rFonts w:ascii="Times New Roman" w:hAnsi="Times New Roman" w:cs="Times New Roman"/>
+          <w:bCs/>
+          <w:sz w:val="21"/>
+          <w:szCs w:val="21"/>
+        </w:rPr>
+        <w:t xml:space="preserve"> a labeled honors section, where present, is graded only under the Honors Research Extension and is not scored under this rubric.</w:t>
+      </w:r>
+    </w:p>
     <w:p>
       <w:pPr>
         <w:rPr>

</xml_diff>

<commit_message>
feat: Score rubric criterion 6 on the corrected paired interval
Criterion 6 now asks for the fold-corrected paired interval and one of the
four Amendment 1 outcomes; a Fall 2026 note gives full credit to a
comparison done as nb08 teaches it. M10 instructions gain the formula.
The doctrine, CLAUDE.md and Decision 14 addendum landed in e65a378
(auto-commit).

Co-Authored-By: Claude Opus 5.5 <noreply@anthropic.com>
</commit_message>
<xml_diff>
--- a/_final_project/2026F/rubric/Predictive_Analytics_Poster_Rubric.docx
+++ b/_final_project/2026F/rubric/Predictive_Analytics_Poster_Rubric.docx
@@ -1043,7 +1043,7 @@
                 <w:sz w:val="21"/>
                 <w:szCs w:val="21"/>
               </w:rPr>
-              <w:t>22–25 pts: Model aligned to data/goal (RF/GBM/XGBoost/SVM/regularized GLM/NN); hyperparameter search (grid/random/Bayesian) inside proper CV; leakage controls (scaling/encoding inside folds); compared with the baseline on identical folds (same splitter and seed) using per-fold paired differences, signed so a positive value favors the complex model, against a practical margin stated before the results; mean paired difference reported with an approximate 95% interval corrected for fold overlap (mean ± t × SD of the differences × √(1/k + 1/(k−1))); verdict names the correct outcome: worthwhile gain (the whole interval lies above the margin: adopt the complex model), worthwhile loss (the whole interval lies below minus the margin: keep the baseline), practically equivalent (the whole interval lies inside ± the margin, so the simpler model wins), or unresolved (anything else: the simpler model is kept as a stated policy, not called equivalent); fold-by-fold wins reported as description, not as the verdict; practical interpretation (effect sizes, trade-offs), plus error/confusion analysis where relevant.</w:t>
+              <w:t>22–25 pts: Model aligned to data/goal (RF/GBM/XGBoost/SVM/regularized GLM/NN); hyperparameter search (grid/random/Bayesian) inside proper CV; leakage controls (scaling/encoding inside folds); compared with the baseline on identical folds (same splitter and seed) using per-fold paired differences (positive favors the complex model) against a margin stated before the results; mean difference reported with an approximate 95% interval corrected for fold overlap: mean ± t × SD(differences) × √(1/k + 1/(k−1)); verdict names the outcome: worthwhile gain (interval entirely above the margin), worthwhile loss (entirely below minus the margin), practically equivalent (entirely inside ± the margin: the simpler model wins), or unresolved (anything else: the simpler model stays as a stated policy, not called equivalent); practical interpretation (effect sizes, trade-offs), plus error/confusion analysis where relevant.</w:t>
             </w:r>
           </w:p>
         </w:tc>
@@ -1444,7 +1444,7 @@
           <w:sz w:val="21"/>
           <w:szCs w:val="21"/>
         </w:rPr>
-        <w:t xml:space="preserve"> a comparison that lacks per-fold paired differences, a stated margin, or the corrected interval gets feedback, not a deduction, on the first draft. All three are scored from M10.</w:t>
+        <w:t xml:space="preserve"> missing paired differences, margin, or corrected interval get feedback, not a deduction, on the first draft; all three are scored from M10.</w:t>
       </w:r>
     </w:p>
     <w:p>
@@ -1476,7 +1476,7 @@
           <w:sz w:val="21"/>
           <w:szCs w:val="21"/>
         </w:rPr>
-        <w:t xml:space="preserve"> a comparison that follows notebook 08 as taught (the descriptive interval, and a verdict from the three outcomes: every fold favors the same model and the gap clears the margin; the sign changes across folds; or the same sign but under the margin) also earns full credit for the interval and the verdict, provided the outcome is applied correctly.</w:t>
+        <w:t xml:space="preserve"> a comparison done as taught in notebook 08 (descriptive interval; verdict from its three outcomes: every fold favors one model and the gap clears the margin, the sign changes across folds, or the same sign under the margin) also earns full credit when the outcome is applied correctly.</w:t>
       </w:r>
     </w:p>
     <w:p>
@@ -1542,15 +1542,6 @@
         </w:rPr>
         <w:t xml:space="preserve"> a labeled honors section, where present, is graded only under the Honors Research Extension and is not scored under this rubric.</w:t>
       </w:r>
-    </w:p>
-    <w:p>
-      <w:pPr>
-        <w:rPr>
-          <w:rFonts w:ascii="Times New Roman" w:hAnsi="Times New Roman" w:cs="Times New Roman"/>
-          <w:sz w:val="21"/>
-          <w:szCs w:val="21"/>
-        </w:rPr>
-      </w:pPr>
     </w:p>
     <w:sectPr>
       <w:pgSz w:w="15840" w:h="12240" w:orient="landscape"/>

</xml_diff>

<commit_message>
feat: Score champion selection in the poster rubric (M09/M10)
Criterion 6 becomes Model Comparison and Champion Selection: margin
with its business meaning and a simplest-first order stated before
comparing, the fold-corrected paired interval read as one of four
outcomes, and one champion justified in the stakeholder's terms.
Criterion 5 asks for fold scores with mean and SD, not a per-model
confidence interval. Transition notes keep M09 feedback-only and
protect nb08/nb14-style work and disclosed after-the-fact margins.

Co-Authored-By: Claude Opus 5.5 <noreply@anthropic.com>
</commit_message>
<xml_diff>
--- a/_final_project/2026F/rubric/Predictive_Analytics_Poster_Rubric.docx
+++ b/_final_project/2026F/rubric/Predictive_Analytics_Poster_Rubric.docx
@@ -276,7 +276,7 @@
                 <w:sz w:val="21"/>
                 <w:szCs w:val="21"/>
               </w:rPr>
-              <w:t>5 pts: Clear, specific predictive objective(s); response type (regression/classification) explicitly identified and justified; strong business/research rationale.</w:t>
+              <w:t>5 pts: Clear, specific predictive objective(s); response type (regression/classification) explicitly identified and justified; names the stakeholder and the decision the predictions support; strong business/research rationale.</w:t>
             </w:r>
           </w:p>
         </w:tc>
@@ -299,26 +299,10 @@
                 <w:sz w:val="21"/>
                 <w:szCs w:val="21"/>
               </w:rPr>
-              <w:t xml:space="preserve">3–4 pts: Goal </w:t>
+              <w:t>3–4 pts: Goal and response type stated, but the stakeholder, the decision, or the rationale is thin; limited link to context.</w:t>
             </w:r>
             <w:proofErr w:type="gramStart"/>
-            <w:r>
-              <w:rPr>
-                <w:rFonts w:ascii="Times New Roman" w:hAnsi="Times New Roman" w:cs="Times New Roman"/>
-                <w:sz w:val="21"/>
-                <w:szCs w:val="21"/>
-              </w:rPr>
-              <w:t>stated;</w:t>
-            </w:r>
             <w:proofErr w:type="gramEnd"/>
-            <w:r>
-              <w:rPr>
-                <w:rFonts w:ascii="Times New Roman" w:hAnsi="Times New Roman" w:cs="Times New Roman"/>
-                <w:sz w:val="21"/>
-                <w:szCs w:val="21"/>
-              </w:rPr>
-              <w:t xml:space="preserve"> response type identified but weakly justified; limited link to context.</w:t>
-            </w:r>
           </w:p>
         </w:tc>
         <w:tc>
@@ -340,7 +324,7 @@
                 <w:sz w:val="21"/>
                 <w:szCs w:val="21"/>
               </w:rPr>
-              <w:t>0–2 pts: Goal unclear/missing; response type unspecified; no rationale.</w:t>
+              <w:t>0–2 pts: Goal unclear/missing; response type unspecified; no link to a stakeholder's decision.</w:t>
             </w:r>
           </w:p>
         </w:tc>
@@ -900,7 +884,7 @@
                 <w:sz w:val="21"/>
                 <w:szCs w:val="21"/>
               </w:rPr>
-              <w:t>14–17 pts: Appropriate simple baseline (e.g., Linear/Logistic Regression); pipeline is leakage-safe; k=5/10 CV with correct metric (RMSE/MAE/Accuracy/F1/AUC); tracks mean/variance; summarizes implications and limitations; proposes concrete next steps.</w:t>
+              <w:t>14–17 pts: Appropriate simple baseline (e.g., Linear/Logistic Regression), the incumbent any complex model must beat; pipeline is leakage-safe; k=5/10 CV (time-respecting for forecasting) with a primary metric chosen for the cost of errors; reports the fold scores with their mean and SD (no per-model confidence interval needed); summarizes implications and limitations; proposes concrete next steps.</w:t>
             </w:r>
           </w:p>
         </w:tc>
@@ -997,7 +981,7 @@
                 <w:sz w:val="21"/>
                 <w:szCs w:val="21"/>
               </w:rPr>
-              <w:t>More Complex Model (Choice, Tuning, Paired Comparison)</w:t>
+              <w:t>Model Comparison and Champion Selection (Choice, Tuning, Paired Comparison, Rationale)</w:t>
             </w:r>
           </w:p>
         </w:tc>
@@ -1043,7 +1027,7 @@
                 <w:sz w:val="21"/>
                 <w:szCs w:val="21"/>
               </w:rPr>
-              <w:t>22–25 pts: Model aligned to data/goal (RF/GBM/XGBoost/SVM/regularized GLM/NN); hyperparameter search (grid/random/Bayesian) inside proper CV; leakage controls (scaling/encoding inside folds); compared with the baseline on identical folds (same splitter and seed) using per-fold paired differences (positive favors the complex model) against a margin stated before the results; mean difference reported with an approximate 95% interval corrected for fold overlap: mean ± t × SD(differences) × √(1/k + 1/(k−1)); verdict names the outcome: worthwhile gain (interval entirely above the margin), worthwhile loss (entirely below minus the margin), practically equivalent (entirely inside ± the margin: the simpler model wins), or unresolved (anything else: the simpler model stays as a stated policy, not called equivalent); practical interpretation (effect sizes, trade-offs), plus error/confusion analysis where relevant.</w:t>
+              <w:t>22–25 pts: Model aligned to data/goal (e.g., RF/GBM/SVM/NN); tuning inside CV with leakage controls. Before comparing: primary metric, margin δ (smallest gain that would change the stakeholder's decision, with its business meaning), and candidate order (simplest first). Identical folds; per-fold differences (positive favors the challenger); interval corrected for fold overlap: mean ± t × SD(differences) × √(1/k + 1/(k−1)); outcome named: worthwhile gain (entirely above δ), worthwhile loss (entirely below −δ), practically equivalent (entirely inside ±δ), or unresolved. One champion (the baseline can win); extra complexity only on a worthwhile gain; rationale in the stakeholder's terms (what the gain means, secondary checks, runner-up, what would change the decision). Fold wins are description only; no model's own interval, interval overlap, or lower bound picks the champion; the test set is not used to select.</w:t>
             </w:r>
           </w:p>
         </w:tc>
@@ -1066,7 +1050,7 @@
                 <w:sz w:val="21"/>
                 <w:szCs w:val="21"/>
               </w:rPr>
-              <w:t>13–21 pts: Plausible model; some tuning with partial documentation; CV present but thin; compares with the baseline on CV means or side-by-side intervals rather than paired per-fold differences; judges a winner or a tie by whether intervals overlap or by fold signs alone; calls the models equivalent when the interval extends past the margin; or states no margin; limited practical takeaways.</w:t>
+              <w:t>13–21 pts: Plausible model and tuning, but the comparison or decision is incomplete: folds not paired; δ missing, set after the results, or without business meaning; verdict from means, overlap, fold signs, or a model's own interval; unresolved called equivalent; or a champion without a rationale tied to the decision.</w:t>
             </w:r>
           </w:p>
         </w:tc>
@@ -1089,7 +1073,7 @@
                 <w:sz w:val="21"/>
                 <w:szCs w:val="21"/>
               </w:rPr>
-              <w:t>0–12 pts: Misaligned/unspecified model; superficial/absent tuning; incorrect CV; opaque selection; no clear comparison or interpretation.</w:t>
+              <w:t>0–12 pts: Misaligned/unspecified model; superficial/absent tuning; incorrect CV; no clear comparison and no justified champion.</w:t>
             </w:r>
           </w:p>
         </w:tc>
@@ -1187,7 +1171,7 @@
                 <w:sz w:val="21"/>
                 <w:szCs w:val="21"/>
               </w:rPr>
-              <w:t>9–10 pts: Clear, scannable poster; logical flow (Intro→Methods→Results→Conclusions); legible, labeled figures/tables (titles, axes, units, legends); consistent typography/layout; code refs/appendix where appropriate; minimal grammar issues.</w:t>
+              <w:t>9–10 pts: Clear, scannable poster; logical flow (Intro→Methods→Results→Conclusions); the champion and its main reason are easy to find; legible, labeled figures/tables (titles, axes, units, legends); consistent typography/layout; code refs/appendix where appropriate; minimal grammar issues.</w:t>
             </w:r>
           </w:p>
         </w:tc>
@@ -1385,7 +1369,7 @@
     </w:tbl>
     <w:p>
       <w:pPr>
-        <w:spacing w:before="120" w:after="0"/>
+        <w:spacing w:before="20" w:after="0"/>
         <w:jc w:val="left"/>
         <w:rPr>
           <w:rFonts w:ascii="Times New Roman" w:hAnsi="Times New Roman" w:cs="Times New Roman"/>
@@ -1400,7 +1384,7 @@
           <w:rFonts w:ascii="Times New Roman" w:hAnsi="Times New Roman" w:cs="Times New Roman"/>
           <w:b/>
           <w:bCs/>
-          <w:sz w:val="21"/>
+          <w:sz w:val="20"/>
           <w:szCs w:val="21"/>
         </w:rPr>
         <w:t>Total:</w:t>
@@ -1409,7 +1393,7 @@
         <w:rPr>
           <w:rFonts w:ascii="Times New Roman" w:hAnsi="Times New Roman" w:cs="Times New Roman"/>
           <w:bCs/>
-          <w:sz w:val="21"/>
+          <w:sz w:val="20"/>
           <w:szCs w:val="21"/>
         </w:rPr>
         <w:t xml:space="preserve"> 100 points. This rubric grades M09 (poster first draft), M10 (final poster), and the Instructor/TA evaluation after the conference.</w:t>
@@ -1417,7 +1401,7 @@
     </w:p>
     <w:p>
       <w:pPr>
-        <w:spacing w:before="40" w:after="0"/>
+        <w:spacing w:before="20" w:after="0"/>
         <w:jc w:val="left"/>
         <w:rPr>
           <w:rFonts w:ascii="Times New Roman" w:hAnsi="Times New Roman" w:cs="Times New Roman"/>
@@ -1432,24 +1416,24 @@
           <w:rFonts w:ascii="Times New Roman" w:hAnsi="Times New Roman" w:cs="Times New Roman"/>
           <w:b/>
           <w:bCs/>
-          <w:sz w:val="21"/>
+          <w:sz w:val="20"/>
           <w:szCs w:val="21"/>
         </w:rPr>
-        <w:t>Criterion 6 at M09:</w:t>
+        <w:t>Criterion 6 at M09 (due Nov 1):</w:t>
       </w:r>
       <w:r>
         <w:rPr>
           <w:rFonts w:ascii="Times New Roman" w:hAnsi="Times New Roman" w:cs="Times New Roman"/>
           <w:bCs/>
-          <w:sz w:val="21"/>
+          <w:sz w:val="20"/>
           <w:szCs w:val="21"/>
         </w:rPr>
-        <w:t xml:space="preserve"> missing paired differences, margin, or corrected interval get feedback, not a deduction, on the first draft; all three are scored from M10.</w:t>
+        <w:t xml:space="preserve"> paired differences, the margin δ, the corrected interval, and the champion statement get feedback, not a deduction, on the first draft; all are scored from M10.</w:t>
       </w:r>
     </w:p>
     <w:p>
       <w:pPr>
-        <w:spacing w:before="40" w:after="0"/>
+        <w:spacing w:before="20" w:after="0"/>
         <w:jc w:val="left"/>
         <w:rPr>
           <w:rFonts w:ascii="Times New Roman" w:hAnsi="Times New Roman" w:cs="Times New Roman"/>
@@ -1464,7 +1448,7 @@
           <w:rFonts w:ascii="Times New Roman" w:hAnsi="Times New Roman" w:cs="Times New Roman"/>
           <w:b/>
           <w:bCs/>
-          <w:sz w:val="21"/>
+          <w:sz w:val="20"/>
           <w:szCs w:val="21"/>
         </w:rPr>
         <w:t>Fall 2026:</w:t>
@@ -1473,15 +1457,15 @@
         <w:rPr>
           <w:rFonts w:ascii="Times New Roman" w:hAnsi="Times New Roman" w:cs="Times New Roman"/>
           <w:bCs/>
-          <w:sz w:val="21"/>
+          <w:sz w:val="20"/>
           <w:szCs w:val="21"/>
         </w:rPr>
-        <w:t xml:space="preserve"> a comparison done as taught in notebook 08 (descriptive interval; verdict from its three outcomes: every fold favors one model and the gap clears the margin, the sign changes across folds, or the same sign under the margin) also earns full credit when the outcome is applied correctly.</w:t>
+        <w:t xml:space="preserve"> the notebooks still teach notebook 08's three-outcome rule; applying it correctly earns full credit, as does a champion chosen as notebook 14 teaches and explained for the stakeholder. If δ or your criteria were set after the M06/M08 results, say so: honest disclosure is not penalized. A baseline champion or an honest “unresolved” verdict can earn full credit. No new model search or test-set opening is required.</w:t>
       </w:r>
     </w:p>
     <w:p>
       <w:pPr>
-        <w:spacing w:before="40" w:after="0"/>
+        <w:spacing w:before="20" w:after="0"/>
         <w:jc w:val="left"/>
         <w:rPr>
           <w:rFonts w:ascii="Times New Roman" w:hAnsi="Times New Roman" w:cs="Times New Roman"/>
@@ -1496,7 +1480,7 @@
           <w:rFonts w:ascii="Times New Roman" w:hAnsi="Times New Roman" w:cs="Times New Roman"/>
           <w:b/>
           <w:bCs/>
-          <w:sz w:val="21"/>
+          <w:sz w:val="20"/>
           <w:szCs w:val="21"/>
         </w:rPr>
         <w:t>AI use:</w:t>
@@ -1505,7 +1489,7 @@
         <w:rPr>
           <w:rFonts w:ascii="Times New Roman" w:hAnsi="Times New Roman" w:cs="Times New Roman"/>
           <w:bCs/>
-          <w:sz w:val="21"/>
+          <w:sz w:val="20"/>
           <w:szCs w:val="21"/>
         </w:rPr>
         <w:t xml:space="preserve"> per the syllabus AI Policy, every poster carries an AI Use Disclosure (the template has a section for it). Errors in AI-assisted work are the team’s responsibility.</w:t>
@@ -1513,7 +1497,7 @@
     </w:p>
     <w:p>
       <w:pPr>
-        <w:spacing w:before="40" w:after="0"/>
+        <w:spacing w:before="20" w:after="0"/>
         <w:jc w:val="left"/>
         <w:rPr>
           <w:rFonts w:ascii="Times New Roman" w:hAnsi="Times New Roman" w:cs="Times New Roman"/>
@@ -1528,7 +1512,7 @@
           <w:rFonts w:ascii="Times New Roman" w:hAnsi="Times New Roman" w:cs="Times New Roman"/>
           <w:b/>
           <w:bCs/>
-          <w:sz w:val="21"/>
+          <w:sz w:val="20"/>
           <w:szCs w:val="21"/>
         </w:rPr>
         <w:t>Honors:</w:t>
@@ -1537,7 +1521,7 @@
         <w:rPr>
           <w:rFonts w:ascii="Times New Roman" w:hAnsi="Times New Roman" w:cs="Times New Roman"/>
           <w:bCs/>
-          <w:sz w:val="21"/>
+          <w:sz w:val="20"/>
           <w:szCs w:val="21"/>
         </w:rPr>
         <w:t xml:space="preserve"> a labeled honors section, where present, is graded only under the Honors Research Extension and is not scored under this rubric.</w:t>
@@ -1545,7 +1529,7 @@
     </w:p>
     <w:sectPr>
       <w:pgSz w:w="15840" w:h="12240" w:orient="landscape"/>
-      <w:pgMar w:top="693" w:right="720" w:bottom="1080" w:left="900" w:header="720" w:footer="720" w:gutter="0"/>
+      <w:pgMar w:top="693" w:right="720" w:bottom="720" w:left="900" w:header="720" w:footer="720" w:gutter="0"/>
       <w:cols w:space="720"/>
       <w:docGrid w:linePitch="360"/>
     </w:sectPr>

</xml_diff>

<commit_message>
fix: Make the Fall 2026 note control rubric criterion 6
The corrected paired interval is recommended, not required, this term.
Criterion 6's Exemplary level accepts notebook 08's rule applied
correctly, and the Competent deductions apply only to the rule a team
used. A disclosed after-the-fact margin is no longer listed as a
deduction. M09/M10 instructions match; points unchanged.

Co-Authored-By: Claude Opus 5.5 <noreply@anthropic.com>
</commit_message>
<xml_diff>
--- a/_final_project/2026F/rubric/Predictive_Analytics_Poster_Rubric.docx
+++ b/_final_project/2026F/rubric/Predictive_Analytics_Poster_Rubric.docx
@@ -1027,7 +1027,7 @@
                 <w:sz w:val="21"/>
                 <w:szCs w:val="21"/>
               </w:rPr>
-              <w:t>22–25 pts: Model aligned to data/goal (e.g., RF/GBM/SVM/NN); tuning inside CV with leakage controls. Before comparing: primary metric, margin δ (smallest gain that would change the stakeholder's decision, with its business meaning), and candidate order (simplest first). Identical folds; per-fold differences (positive favors the challenger); interval corrected for fold overlap: mean ± t × SD(differences) × √(1/k + 1/(k−1)); outcome named: worthwhile gain (entirely above δ), worthwhile loss (entirely below −δ), practically equivalent (entirely inside ±δ), or unresolved. One champion (the baseline can win); extra complexity only on a worthwhile gain; rationale in the stakeholder's terms (what the gain means, secondary checks, runner-up, what would change the decision). Fold wins are description only; no model's own interval, interval overlap, or lower bound picks the champion; the test set is not used to select.</w:t>
+              <w:t>22–25 pts: Model aligned to data/goal (e.g., RF/GBM/SVM/NN); tuning inside CV with leakage controls. Before comparing: primary metric, margin δ (smallest gain that would change the stakeholder's decision, with its business meaning), and candidate order (simplest first). Identical folds; per-fold differences (positive favors the challenger); the verdict from a rule applied correctly: notebook 08's rule (Fall 2026 note) or, recommended, the interval corrected for fold overlap, mean ± t × SD(differences) × √(1/k + 1/(k−1)), named as worthwhile gain (entirely above δ), worthwhile loss (entirely below −δ), practically equivalent (entirely inside ±δ), or unresolved. One champion (the baseline can win); extra complexity only on a worthwhile gain; rationale in the stakeholder's terms (what the gain means, secondary checks, runner-up, what would change the decision). No model's own interval, interval overlap, or lower bound picks the champion; the test set is not used to select.</w:t>
             </w:r>
           </w:p>
         </w:tc>
@@ -1050,7 +1050,7 @@
                 <w:sz w:val="21"/>
                 <w:szCs w:val="21"/>
               </w:rPr>
-              <w:t>13–21 pts: Plausible model and tuning, but the comparison or decision is incomplete: folds not paired; δ missing, set after the results, or without business meaning; verdict from means, overlap, fold signs, or a model's own interval; unresolved called equivalent; or a champion without a rationale tied to the decision.</w:t>
+              <w:t>13–21 pts: Plausible model and tuning, but the comparison or decision is incomplete, or misapplies the rule the team used: folds not paired; δ missing, without business meaning, or set after the results without saying so; verdict from means alone, interval overlap, or a model's own interval; with the corrected interval, unresolved called equivalent; or a champion without a rationale tied to the decision.</w:t>
             </w:r>
           </w:p>
         </w:tc>
@@ -1428,7 +1428,7 @@
           <w:sz w:val="20"/>
           <w:szCs w:val="21"/>
         </w:rPr>
-        <w:t xml:space="preserve"> paired differences, the margin δ, the corrected interval, and the champion statement get feedback, not a deduction, on the first draft; all are scored from M10.</w:t>
+        <w:t xml:space="preserve"> the comparison and the champion get feedback, not a deduction, on the first draft; they are scored from M10, under the Fall 2026 note.</w:t>
       </w:r>
     </w:p>
     <w:p>
@@ -1451,7 +1451,7 @@
           <w:sz w:val="20"/>
           <w:szCs w:val="21"/>
         </w:rPr>
-        <w:t>Fall 2026:</w:t>
+        <w:t>Fall 2026 (this note controls criterion 6):</w:t>
       </w:r>
       <w:r>
         <w:rPr>
@@ -1460,7 +1460,7 @@
           <w:sz w:val="20"/>
           <w:szCs w:val="21"/>
         </w:rPr>
-        <w:t xml:space="preserve"> the notebooks still teach notebook 08's three-outcome rule; applying it correctly earns full credit, as does a champion chosen as notebook 14 teaches and explained for the stakeholder. If δ or your criteria were set after the M06/M08 results, say so: honest disclosure is not penalized. A baseline champion or an honest “unresolved” verdict can earn full credit. No new model search or test-set opening is required.</w:t>
+        <w:t xml:space="preserve"> the notebooks still teach notebook 08's three-outcome rule; applying it correctly earns full credit, as does a champion chosen as notebook 14 teaches and explained for the stakeholder. The corrected interval is recommended, not required. If δ or your criteria were set after the M06/M08 results, say so: honest disclosure is not penalized. A baseline champion or an honest “unresolved” verdict can earn full credit. No new model search or test-set opening is required.</w:t>
       </w:r>
     </w:p>
     <w:p>

</xml_diff>

<commit_message>
fix: Align the poster rubric and template with the published notebooks
Until the Nov 8 notebook update, criterion 6 scores notebook 08's
three-outcome paired rule against a practical margin and the champion
selection notebook 14 teaches; the corrected interval, four outcomes
and delta move out of the rubric. Criterion 5 again asks for the CV mean
with its descriptive 95% interval. The template's methodology, results
and business-implication prompts follow nb08/nb14/nb17, and the
acknowledgements box now carries a references placeholder.

Co-Authored-By: Claude Opus 5.5 <noreply@anthropic.com>
</commit_message>
<xml_diff>
--- a/_final_project/2026F/rubric/Predictive_Analytics_Poster_Rubric.docx
+++ b/_final_project/2026F/rubric/Predictive_Analytics_Poster_Rubric.docx
@@ -884,7 +884,7 @@
                 <w:sz w:val="21"/>
                 <w:szCs w:val="21"/>
               </w:rPr>
-              <w:t>14–17 pts: Appropriate simple baseline (e.g., Linear/Logistic Regression), the incumbent any complex model must beat; pipeline is leakage-safe; k=5/10 CV (time-respecting for forecasting) with a primary metric chosen for the cost of errors; reports the fold scores with their mean and SD (no per-model confidence interval needed); summarizes implications and limitations; proposes concrete next steps.</w:t>
+              <w:t>14–17 pts: Appropriate simple baseline (e.g., Linear/Logistic Regression), the reference any complex model must beat; pipeline is leakage-safe; k=5/10 CV (time-respecting for forecasting) with a primary metric chosen for the cost of errors; reports the CV mean with its SD and approximate 95% interval, labeled descriptive (notebook 08); summarizes implications and limitations; proposes concrete next steps.</w:t>
             </w:r>
           </w:p>
         </w:tc>
@@ -1027,7 +1027,7 @@
                 <w:sz w:val="21"/>
                 <w:szCs w:val="21"/>
               </w:rPr>
-              <w:t>22–25 pts: Model aligned to data/goal (e.g., RF/GBM/SVM/NN); tuning inside CV with leakage controls. Before comparing: primary metric, margin δ (smallest gain that would change the stakeholder's decision, with its business meaning), and candidate order (simplest first). Identical folds; per-fold differences (positive favors the challenger); the verdict from a rule applied correctly: notebook 08's rule (Fall 2026 note) or, recommended, the interval corrected for fold overlap, mean ± t × SD(differences) × √(1/k + 1/(k−1)), named as worthwhile gain (entirely above δ), worthwhile loss (entirely below −δ), practically equivalent (entirely inside ±δ), or unresolved. One champion (the baseline can win); extra complexity only on a worthwhile gain; rationale in the stakeholder's terms (what the gain means, secondary checks, runner-up, what would change the decision). No model's own interval, interval overlap, or lower bound picks the champion; the test set is not used to select.</w:t>
+              <w:t>22–25 pts: Model aligned to data/goal (e.g., RF/GBM/SVM/NN); tuning inside CV with leakage controls. Before comparing: the primary metric and a practical margin (the smallest gain that would change the stakeholder's decision, with its business meaning). Baseline and tuned model (and any other finalist) compared on identical folds (same splitter and seed): per-fold paired differences and their mean, with the verdict named correctly under notebook 08's rule: real difference (every fold favors the same model and the mean gap clears the margin), no winner (the sign changes across folds), or practically equivalent (same sign but under the margin, so the simpler model wins). One champion, chosen as notebook 14 teaches (the baseline can win); extra complexity only on a real difference; rationale in the stakeholder's terms (what the gain means, secondary checks, runner-up). Interval overlap does not pick the champion; the test set is not used to select.</w:t>
             </w:r>
           </w:p>
         </w:tc>
@@ -1050,7 +1050,7 @@
                 <w:sz w:val="21"/>
                 <w:szCs w:val="21"/>
               </w:rPr>
-              <w:t>13–21 pts: Plausible model and tuning, but the comparison or decision is incomplete, or misapplies the rule the team used: folds not paired; δ missing, without business meaning, or set after the results without saying so; verdict from means alone, interval overlap, or a model's own interval; with the corrected interval, unresolved called equivalent; or a champion without a rationale tied to the decision.</w:t>
+              <w:t>13–21 pts: Plausible model and tuning, but the comparison or decision is incomplete or misapplied: folds not paired; margin missing, without business meaning, or set after the results without saying so; verdict from means alone or from whether two intervals overlap; fold signs that disagree read as a win; or a champion without a rationale tied to the decision.</w:t>
             </w:r>
           </w:p>
         </w:tc>
@@ -1428,7 +1428,7 @@
           <w:sz w:val="20"/>
           <w:szCs w:val="21"/>
         </w:rPr>
-        <w:t xml:space="preserve"> the comparison and the champion get feedback, not a deduction, on the first draft; they are scored from M10, under the Fall 2026 note.</w:t>
+        <w:t xml:space="preserve"> the comparison and the champion get feedback, not a deduction, on the first draft; they are scored from M10.</w:t>
       </w:r>
     </w:p>
     <w:p>
@@ -1451,7 +1451,7 @@
           <w:sz w:val="20"/>
           <w:szCs w:val="21"/>
         </w:rPr>
-        <w:t>Fall 2026 (this note controls criterion 6):</w:t>
+        <w:t>Criterion 6 follows the notebooks:</w:t>
       </w:r>
       <w:r>
         <w:rPr>
@@ -1460,7 +1460,7 @@
           <w:sz w:val="20"/>
           <w:szCs w:val="21"/>
         </w:rPr>
-        <w:t xml:space="preserve"> the notebooks still teach notebook 08's three-outcome rule; applying it correctly earns full credit, as does a champion chosen as notebook 14 teaches and explained for the stakeholder. The corrected interval is recommended, not required. If δ or your criteria were set after the M06/M08 results, say so: honest disclosure is not penalized. A baseline champion or an honest “unresolved” verdict can earn full credit. No new model search or test-set opening is required.</w:t>
+        <w:t xml:space="preserve"> the paired comparison and margin from notebook 08 and the champion selection from notebook 14. If your margin was set after the M06/M08 results, say so on the poster: honest disclosure is not penalized. A baseline champion or an honest “no winner” verdict can earn full credit. No new model search or test-set opening is required.</w:t>
       </w:r>
     </w:p>
     <w:p>

</xml_diff>